<commit_message>
audit final tamis : 3 corrections factuelles (Sumayya + Yusuf Islam + vérif regard_versets)
- regard_versets 24:58 : déjà corrigé en phase 1, vérifié OK
- savais_tu Fait 73 : Cat Stevens 23→28 ans, ajout 1976/Malibu/frère David
- tafakkur_recits : Sumayya bint Khabbat → Khayyat (coquille patronyme)
- Régénération savais_tu.docx + tafakkur_recits.docx

Co-Authored-By: Claude Opus 4.6 (1M context) <noreply@anthropic.com>
</commit_message>
<xml_diff>
--- a/ECRITS_NIYYAH/tafakkur_recits.docx
+++ b/ECRITS_NIYYAH/tafakkur_recits.docx
@@ -15264,7 +15264,7 @@
           <w:sz w:val="20"/>
           <w:szCs w:val="20"/>
         </w:rPr>
-        <w:t xml:space="preserve">Sumayya bint Khabbat (Tabarî, Ibn Sa'd)</w:t>
+        <w:t xml:space="preserve">Sumayya bint Khayyat (Tabarî, Ibn Sa'd)</w:t>
       </w:r>
     </w:p>
     <w:p>
@@ -15303,7 +15303,7 @@
           <w:sz w:val="22"/>
           <w:szCs w:val="22"/>
         </w:rPr>
-        <w:t xml:space="preserve">Sumayya bint Khabbat, mère de 'Ammâr ibn Yâsir, fut la première martyre de l'islam. Esclave âgée à La Mecque, elle refusa de renier sa foi sous la torture d'Abû Jahl. Il finit par la transpercer d'une lance dans le ventre. Elle mourut sans rien renier. Quand le Prophète ﷺ passait devant la famille Yâsir torturée, sans pouvoir intervenir, il leur disait : « Patience, famille de Yâsir, votre rendez-vous est le Paradis. » (Tabarî, Ibn Sa'd, *Tabaqât*). 1400 ans plus tard, tu es musulman en France grâce à des chaînes humaines qui n'ont pas cédé. Sumayya en est l'un des premiers maillons. Le détail bouleverse : la première vie donnée pour cette foi fut celle d'une femme âgée, esclave, anonyme dans son monde. Allâh a posé la première pierre — pas par un guerrier, mais par une vieille femme qui n'a pas plié. Chaque fois que tu pries, tu honores ou tu trahis ce sacrifice. Tu hérites de ce qu'elle a payé.</w:t>
+        <w:t xml:space="preserve">Sumayya bint Khayyat, mère de 'Ammâr ibn Yâsir, fut la première martyre de l'islam. Esclave âgée à La Mecque, elle refusa de renier sa foi sous la torture d'Abû Jahl. Il finit par la transpercer d'une lance dans le ventre. Elle mourut sans rien renier. Quand le Prophète ﷺ passait devant la famille Yâsir torturée, sans pouvoir intervenir, il leur disait : « Patience, famille de Yâsir, votre rendez-vous est le Paradis. » (Tabarî, Ibn Sa'd, *Tabaqât*). 1400 ans plus tard, tu es musulman en France grâce à des chaînes humaines qui n'ont pas cédé. Sumayya en est l'un des premiers maillons. Le détail bouleverse : la première vie donnée pour cette foi fut celle d'une femme âgée, esclave, anonyme dans son monde. Allâh a posé la première pierre — pas par un guerrier, mais par une vieille femme qui n'a pas plié. Chaque fois que tu pries, tu honores ou tu trahis ce sacrifice. Tu hérites de ce qu'elle a payé.</w:t>
       </w:r>
     </w:p>
     <w:p>

</xml_diff>